<commit_message>
Ankraj ve ankrajlı iksa: GEC-4'e göre mühendislik düzeltmeleri
- Yumuşak kil zarfı: 4 < Ns < 5,14 için Ka = 0,22, Ns >= 5,14 için Henkel (GEC-4 5.2.6)
- Kilde taban kabarması kontrolü (GEC-4 5.8.2.2, denk. 34-37); B ve yapı türü zorunlu
- Kum ve sert kilde GEC-4 trapez zarfı (Şekil 24, 27), sert kilde en az 3H²
- Tek seviyede serbest zemin desteği ile GEC-4 zarfının büyüğü
- Ankraj: χ kayma yüzeyine dik, en küçük kök boyu, kayada FS 3,0, aralık uyarısı
- Pasif güvenlik sayısı zorunlu girdi; dış stabilite için zorunlu uyarı
- Web/rapor: kil girdileri, seviye kontrolleri, profil bayatlığı, rapor girdileri, metinler
- docs/qa/ankraj-muhendislik-kontrolu.md

Co-Authored-By: Claude Opus 5.5 (1M context) <noreply@anthropic.com>
Claude-Session: https://claude.ai/code/session_0164Y5cX1GYfYdpR8gu6bezQ
</commit_message>
<xml_diff>
--- a/docs/qa/g8/rapor_en.docx
+++ b/docs/qa/g8/rapor_en.docx
@@ -5167,7 +5167,7 @@
           </w:tcPr>
           <w:p>
             <w:r>
-              <w:t>Passive factor of safety</w:t>
+              <w:t>Surcharge basis</w:t>
             </w:r>
           </w:p>
         </w:tc>
@@ -5177,7 +5177,7 @@
           </w:tcPr>
           <w:p>
             <w:r>
-              <w:t>1.50</w:t>
+              <w:t>Per horizontal projection</w:t>
             </w:r>
           </w:p>
         </w:tc>
@@ -5189,7 +5189,7 @@
           </w:tcPr>
           <w:p>
             <w:r>
-              <w:t>Method</w:t>
+              <w:t>Passive factor of safety</w:t>
             </w:r>
           </w:p>
         </w:tc>
@@ -5199,7 +5199,7 @@
           </w:tcPr>
           <w:p>
             <w:r>
-              <w:t>Apparent pressure, hinge method</w:t>
+              <w:t>1.50</w:t>
             </w:r>
           </w:p>
         </w:tc>
@@ -5211,7 +5211,7 @@
           </w:tcPr>
           <w:p>
             <w:r>
-              <w:t>Theoretical embedment D0 (m)</w:t>
+              <w:t>Embedment increase</w:t>
             </w:r>
           </w:p>
         </w:tc>
@@ -5221,7 +5221,7 @@
           </w:tcPr>
           <w:p>
             <w:r>
-              <w:t>7.71</w:t>
+              <w:t>—</w:t>
             </w:r>
           </w:p>
         </w:tc>
@@ -5233,7 +5233,7 @@
           </w:tcPr>
           <w:p>
             <w:r>
-              <w:t>Design embedment D (m)</w:t>
+              <w:t>Allowable stress (MPa)</w:t>
             </w:r>
           </w:p>
         </w:tc>
@@ -5243,7 +5243,7 @@
           </w:tcPr>
           <w:p>
             <w:r>
-              <w:t>9.25</w:t>
+              <w:t>—</w:t>
             </w:r>
           </w:p>
         </w:tc>
@@ -5255,7 +5255,7 @@
           </w:tcPr>
           <w:p>
             <w:r>
-              <w:t>Wall length (m)</w:t>
+              <w:t>Method</w:t>
             </w:r>
           </w:p>
         </w:tc>
@@ -5265,7 +5265,7 @@
           </w:tcPr>
           <w:p>
             <w:r>
-              <w:t>19.25</w:t>
+              <w:t>Apparent pressure, hinge method</w:t>
             </w:r>
           </w:p>
         </w:tc>
@@ -5277,7 +5277,7 @@
           </w:tcPr>
           <w:p>
             <w:r>
-              <w:t>Base reaction R_B (kN/m)</w:t>
+              <w:t>Theoretical embedment D0 (m)</w:t>
             </w:r>
           </w:p>
         </w:tc>
@@ -5287,7 +5287,7 @@
           </w:tcPr>
           <w:p>
             <w:r>
-              <w:t>52.9</w:t>
+              <w:t>7.20</w:t>
             </w:r>
           </w:p>
         </w:tc>
@@ -5299,7 +5299,7 @@
           </w:tcPr>
           <w:p>
             <w:r>
-              <w:t>Max moment (kNm/m)</w:t>
+              <w:t>Design embedment D (m)</w:t>
             </w:r>
           </w:p>
         </w:tc>
@@ -5309,7 +5309,7 @@
           </w:tcPr>
           <w:p>
             <w:r>
-              <w:t>431.4</w:t>
+              <w:t>8.64</w:t>
             </w:r>
           </w:p>
         </w:tc>
@@ -5321,7 +5321,7 @@
           </w:tcPr>
           <w:p>
             <w:r>
-              <w:t>Max shear (kN/m)</w:t>
+              <w:t>Wall length (m)</w:t>
             </w:r>
           </w:p>
         </w:tc>
@@ -5331,7 +5331,7 @@
           </w:tcPr>
           <w:p>
             <w:r>
-              <w:t>119.8</w:t>
+              <w:t>18.64</w:t>
             </w:r>
           </w:p>
         </w:tc>
@@ -5343,7 +5343,343 @@
           </w:tcPr>
           <w:p>
             <w:r>
-              <w:t>Required section modulus (cm³)</w:t>
+              <w:t>Base reaction R_B (kN/m)</w:t>
+            </w:r>
+          </w:p>
+        </w:tc>
+        <w:tc>
+          <w:tcPr>
+            <w:tcW w:type="dxa" w:w="4320"/>
+          </w:tcPr>
+          <w:p>
+            <w:r>
+              <w:t>31.2</w:t>
+            </w:r>
+          </w:p>
+        </w:tc>
+      </w:tr>
+      <w:tr>
+        <w:tc>
+          <w:tcPr>
+            <w:tcW w:type="dxa" w:w="4320"/>
+          </w:tcPr>
+          <w:p>
+            <w:r>
+              <w:t>Max moment (kNm/m)</w:t>
+            </w:r>
+          </w:p>
+        </w:tc>
+        <w:tc>
+          <w:tcPr>
+            <w:tcW w:type="dxa" w:w="4320"/>
+          </w:tcPr>
+          <w:p>
+            <w:r>
+              <w:t>327.3</w:t>
+            </w:r>
+          </w:p>
+        </w:tc>
+      </w:tr>
+      <w:tr>
+        <w:tc>
+          <w:tcPr>
+            <w:tcW w:type="dxa" w:w="4320"/>
+          </w:tcPr>
+          <w:p>
+            <w:r>
+              <w:t>Max shear (kN/m)</w:t>
+            </w:r>
+          </w:p>
+        </w:tc>
+        <w:tc>
+          <w:tcPr>
+            <w:tcW w:type="dxa" w:w="4320"/>
+          </w:tcPr>
+          <w:p>
+            <w:r>
+              <w:t>98.1</w:t>
+            </w:r>
+          </w:p>
+        </w:tc>
+      </w:tr>
+      <w:tr>
+        <w:tc>
+          <w:tcPr>
+            <w:tcW w:type="dxa" w:w="4320"/>
+          </w:tcPr>
+          <w:p>
+            <w:r>
+              <w:t>Required section modulus (cm³) (cm³/m)</w:t>
+            </w:r>
+          </w:p>
+        </w:tc>
+        <w:tc>
+          <w:tcPr>
+            <w:tcW w:type="dxa" w:w="4320"/>
+          </w:tcPr>
+          <w:p>
+            <w:r>
+              <w:t>—</w:t>
+            </w:r>
+          </w:p>
+        </w:tc>
+      </w:tr>
+    </w:tbl>
+    <w:p/>
+    <w:p>
+      <w:pPr>
+        <w:pStyle w:val="Heading3"/>
+      </w:pPr>
+      <w:r>
+        <w:t>Design the anchors of every level</w:t>
+      </w:r>
+    </w:p>
+    <w:tbl>
+      <w:tblPr>
+        <w:tblStyle w:val="TableGrid"/>
+        <w:tblW w:type="auto" w:w="0"/>
+        <w:tblLook w:firstColumn="1" w:firstRow="1" w:lastColumn="0" w:lastRow="0" w:noHBand="0" w:noVBand="1" w:val="04A0"/>
+      </w:tblPr>
+      <w:tblGrid>
+        <w:gridCol w:w="4320"/>
+        <w:gridCol w:w="4320"/>
+      </w:tblGrid>
+      <w:tr>
+        <w:tc>
+          <w:tcPr>
+            <w:tcW w:type="dxa" w:w="4320"/>
+          </w:tcPr>
+          <w:p>
+            <w:r/>
+            <w:r>
+              <w:rPr>
+                <w:b/>
+              </w:rPr>
+              <w:t>Item</w:t>
+            </w:r>
+          </w:p>
+        </w:tc>
+        <w:tc>
+          <w:tcPr>
+            <w:tcW w:type="dxa" w:w="4320"/>
+          </w:tcPr>
+          <w:p>
+            <w:r/>
+            <w:r>
+              <w:rPr>
+                <w:b/>
+              </w:rPr>
+              <w:t>Value</w:t>
+            </w:r>
+          </w:p>
+        </w:tc>
+      </w:tr>
+      <w:tr>
+        <w:tc>
+          <w:tcPr>
+            <w:tcW w:type="dxa" w:w="4320"/>
+          </w:tcPr>
+          <w:p>
+            <w:r>
+              <w:t>Factor of safety FS (bond)</w:t>
+            </w:r>
+          </w:p>
+        </w:tc>
+        <w:tc>
+          <w:tcPr>
+            <w:tcW w:type="dxa" w:w="4320"/>
+          </w:tcPr>
+          <w:p>
+            <w:r>
+              <w:t>2.00</w:t>
+            </w:r>
+          </w:p>
+        </w:tc>
+      </w:tr>
+      <w:tr>
+        <w:tc>
+          <w:tcPr>
+            <w:tcW w:type="dxa" w:w="4320"/>
+          </w:tcPr>
+          <w:p>
+            <w:r>
+              <w:t>Load transfer used (kN/m)</w:t>
+            </w:r>
+          </w:p>
+        </w:tc>
+        <w:tc>
+          <w:tcPr>
+            <w:tcW w:type="dxa" w:w="4320"/>
+          </w:tcPr>
+          <w:p>
+            <w:r>
+              <w:t>100.0</w:t>
+            </w:r>
+          </w:p>
+        </w:tc>
+      </w:tr>
+      <w:tr>
+        <w:tc>
+          <w:tcPr>
+            <w:tcW w:type="dxa" w:w="4320"/>
+          </w:tcPr>
+          <w:p>
+            <w:r>
+              <w:t>Lock-off load ratio</w:t>
+            </w:r>
+          </w:p>
+        </w:tc>
+        <w:tc>
+          <w:tcPr>
+            <w:tcW w:type="dxa" w:w="4320"/>
+          </w:tcPr>
+          <w:p>
+            <w:r>
+              <w:t>1.00</w:t>
+            </w:r>
+          </w:p>
+        </w:tc>
+      </w:tr>
+      <w:tr>
+        <w:tc>
+          <w:tcPr>
+            <w:tcW w:type="dxa" w:w="4320"/>
+          </w:tcPr>
+          <w:p>
+            <w:r>
+              <w:t>Test load factor</w:t>
+            </w:r>
+          </w:p>
+        </w:tc>
+        <w:tc>
+          <w:tcPr>
+            <w:tcW w:type="dxa" w:w="4320"/>
+          </w:tcPr>
+          <w:p>
+            <w:r>
+              <w:t>1.33</w:t>
+            </w:r>
+          </w:p>
+        </w:tc>
+      </w:tr>
+      <w:tr>
+        <w:tc>
+          <w:tcPr>
+            <w:tcW w:type="dxa" w:w="4320"/>
+          </w:tcPr>
+          <w:p>
+            <w:r>
+              <w:t>Design load limit (× SMTS)</w:t>
+            </w:r>
+          </w:p>
+        </w:tc>
+        <w:tc>
+          <w:tcPr>
+            <w:tcW w:type="dxa" w:w="4320"/>
+          </w:tcPr>
+          <w:p>
+            <w:r>
+              <w:t>0.60</w:t>
+            </w:r>
+          </w:p>
+        </w:tc>
+      </w:tr>
+      <w:tr>
+        <w:tc>
+          <w:tcPr>
+            <w:tcW w:type="dxa" w:w="4320"/>
+          </w:tcPr>
+          <w:p>
+            <w:r>
+              <w:t>Lock-off limit (× SMTS)</w:t>
+            </w:r>
+          </w:p>
+        </w:tc>
+        <w:tc>
+          <w:tcPr>
+            <w:tcW w:type="dxa" w:w="4320"/>
+          </w:tcPr>
+          <w:p>
+            <w:r>
+              <w:t>0.70</w:t>
+            </w:r>
+          </w:p>
+        </w:tc>
+      </w:tr>
+      <w:tr>
+        <w:tc>
+          <w:tcPr>
+            <w:tcW w:type="dxa" w:w="4320"/>
+          </w:tcPr>
+          <w:p>
+            <w:r>
+              <w:t>Test load limit (× SMTS)</w:t>
+            </w:r>
+          </w:p>
+        </w:tc>
+        <w:tc>
+          <w:tcPr>
+            <w:tcW w:type="dxa" w:w="4320"/>
+          </w:tcPr>
+          <w:p>
+            <w:r>
+              <w:t>0.80</w:t>
+            </w:r>
+          </w:p>
+        </w:tc>
+      </w:tr>
+      <w:tr>
+        <w:tc>
+          <w:tcPr>
+            <w:tcW w:type="dxa" w:w="4320"/>
+          </w:tcPr>
+          <w:p>
+            <w:r>
+              <w:t>Tendon type</w:t>
+            </w:r>
+          </w:p>
+        </w:tc>
+        <w:tc>
+          <w:tcPr>
+            <w:tcW w:type="dxa" w:w="4320"/>
+          </w:tcPr>
+          <w:p>
+            <w:r>
+              <w:t>Strand</w:t>
+            </w:r>
+          </w:p>
+        </w:tc>
+      </w:tr>
+      <w:tr>
+        <w:tc>
+          <w:tcPr>
+            <w:tcW w:type="dxa" w:w="4320"/>
+          </w:tcPr>
+          <w:p>
+            <w:r>
+              <w:t>Anchor ground</w:t>
+            </w:r>
+          </w:p>
+        </w:tc>
+        <w:tc>
+          <w:tcPr>
+            <w:tcW w:type="dxa" w:w="4320"/>
+          </w:tcPr>
+          <w:p>
+            <w:r>
+              <w:t>Soil</w:t>
+            </w:r>
+          </w:p>
+        </w:tc>
+      </w:tr>
+      <w:tr>
+        <w:tc>
+          <w:tcPr>
+            <w:tcW w:type="dxa" w:w="4320"/>
+          </w:tcPr>
+          <w:p>
+            <w:r>
+              <w:t>Bond start behind wedge (m)</w:t>
             </w:r>
           </w:p>
         </w:tc>
@@ -5537,7 +5873,7 @@
         <w:rPr>
           <w:b w:val="0"/>
         </w:rPr>
-        <w:t>Apparent pressure envelope (sand): p_max = 42.3 kPa, total thrust 423.3 kN/m.</w:t>
+        <w:t>Apparent pressure envelope (sand): p_max = 48.3 kPa, total thrust 423.3 kN/m.</w:t>
       </w:r>
     </w:p>
     <w:p>
@@ -5715,7 +6051,7 @@
           </w:tcPr>
           <w:p>
             <w:r>
-              <w:t>142.9</w:t>
+              <w:t>131.9</w:t>
             </w:r>
           </w:p>
         </w:tc>
@@ -5725,7 +6061,7 @@
           </w:tcPr>
           <w:p>
             <w:r>
-              <w:t>357.2</w:t>
+              <w:t>329.7</w:t>
             </w:r>
           </w:p>
         </w:tc>
@@ -5735,7 +6071,7 @@
           </w:tcPr>
           <w:p>
             <w:r>
-              <w:t>6.91</w:t>
+              <w:t>7.22</w:t>
             </w:r>
           </w:p>
         </w:tc>
@@ -5745,7 +6081,7 @@
           </w:tcPr>
           <w:p>
             <w:r>
-              <w:t>7.14</w:t>
+              <w:t>6.59</w:t>
             </w:r>
           </w:p>
         </w:tc>
@@ -5797,7 +6133,7 @@
           </w:tcPr>
           <w:p>
             <w:r>
-              <w:t>111.1</w:t>
+              <w:t>135.6</w:t>
             </w:r>
           </w:p>
         </w:tc>
@@ -5807,7 +6143,7 @@
           </w:tcPr>
           <w:p>
             <w:r>
-              <w:t>277.8</w:t>
+              <w:t>339.1</w:t>
             </w:r>
           </w:p>
         </w:tc>
@@ -5817,7 +6153,7 @@
           </w:tcPr>
           <w:p>
             <w:r>
-              <w:t>5.18</w:t>
+              <w:t>5.48</w:t>
             </w:r>
           </w:p>
         </w:tc>
@@ -5827,7 +6163,7 @@
           </w:tcPr>
           <w:p>
             <w:r>
-              <w:t>5.56</w:t>
+              <w:t>6.78</w:t>
             </w:r>
           </w:p>
         </w:tc>
@@ -5837,7 +6173,7 @@
           </w:tcPr>
           <w:p>
             <w:r>
-              <w:t>2 × 15 mm strand, ASTM A416 Gr 270 (metric 1860)</w:t>
+              <w:t>3 × 15 mm strand, ASTM A416 Gr 270 (metric 1860)</w:t>
             </w:r>
           </w:p>
         </w:tc>
@@ -5879,7 +6215,7 @@
           </w:tcPr>
           <w:p>
             <w:r>
-              <w:t>116.4</w:t>
+              <w:t>124.6</w:t>
             </w:r>
           </w:p>
         </w:tc>
@@ -5889,7 +6225,7 @@
           </w:tcPr>
           <w:p>
             <w:r>
-              <w:t>291.0</w:t>
+              <w:t>311.5</w:t>
             </w:r>
           </w:p>
         </w:tc>
@@ -5909,7 +6245,7 @@
           </w:tcPr>
           <w:p>
             <w:r>
-              <w:t>5.82</w:t>
+              <w:t>6.23</w:t>
             </w:r>
           </w:p>
         </w:tc>
@@ -5920,6 +6256,582 @@
           <w:p>
             <w:r>
               <w:t>2 × 15 mm strand, ASTM A416 Gr 270 (metric 1860)</w:t>
+            </w:r>
+          </w:p>
+        </w:tc>
+      </w:tr>
+    </w:tbl>
+    <w:p/>
+    <w:tbl>
+      <w:tblPr>
+        <w:tblStyle w:val="TableGrid"/>
+        <w:tblW w:type="auto" w:w="0"/>
+        <w:tblLook w:firstColumn="1" w:firstRow="1" w:lastColumn="0" w:lastRow="0" w:noHBand="0" w:noVBand="1" w:val="04A0"/>
+      </w:tblPr>
+      <w:tblGrid>
+        <w:gridCol w:w="2160"/>
+        <w:gridCol w:w="2160"/>
+        <w:gridCol w:w="2160"/>
+        <w:gridCol w:w="2160"/>
+      </w:tblGrid>
+      <w:tr>
+        <w:tc>
+          <w:tcPr>
+            <w:tcW w:type="dxa" w:w="2160"/>
+          </w:tcPr>
+          <w:p>
+            <w:r/>
+            <w:r>
+              <w:rPr>
+                <w:b/>
+              </w:rPr>
+              <w:t>Check</w:t>
+            </w:r>
+          </w:p>
+        </w:tc>
+        <w:tc>
+          <w:tcPr>
+            <w:tcW w:type="dxa" w:w="2160"/>
+          </w:tcPr>
+          <w:p>
+            <w:r/>
+            <w:r>
+              <w:rPr>
+                <w:b/>
+              </w:rPr>
+              <w:t>Demand</w:t>
+            </w:r>
+          </w:p>
+        </w:tc>
+        <w:tc>
+          <w:tcPr>
+            <w:tcW w:type="dxa" w:w="2160"/>
+          </w:tcPr>
+          <w:p>
+            <w:r/>
+            <w:r>
+              <w:rPr>
+                <w:b/>
+              </w:rPr>
+              <w:t>Limit</w:t>
+            </w:r>
+          </w:p>
+        </w:tc>
+        <w:tc>
+          <w:tcPr>
+            <w:tcW w:type="dxa" w:w="2160"/>
+          </w:tcPr>
+          <w:p>
+            <w:r/>
+            <w:r>
+              <w:rPr>
+                <w:b/>
+              </w:rPr>
+              <w:t>Result</w:t>
+            </w:r>
+          </w:p>
+        </w:tc>
+      </w:tr>
+      <w:tr>
+        <w:tc>
+          <w:tcPr>
+            <w:tcW w:type="dxa" w:w="2160"/>
+          </w:tcPr>
+          <w:p>
+            <w:r>
+              <w:t>1.50 m: Design load ≤ tendon limit</w:t>
+            </w:r>
+          </w:p>
+        </w:tc>
+        <w:tc>
+          <w:tcPr>
+            <w:tcW w:type="dxa" w:w="2160"/>
+          </w:tcPr>
+          <w:p>
+            <w:r>
+              <w:t>329.69</w:t>
+            </w:r>
+          </w:p>
+        </w:tc>
+        <w:tc>
+          <w:tcPr>
+            <w:tcW w:type="dxa" w:w="2160"/>
+          </w:tcPr>
+          <w:p>
+            <w:r>
+              <w:t>469.26</w:t>
+            </w:r>
+          </w:p>
+        </w:tc>
+        <w:tc>
+          <w:tcPr>
+            <w:tcW w:type="dxa" w:w="2160"/>
+          </w:tcPr>
+          <w:p>
+            <w:r>
+              <w:t>Pass</w:t>
+            </w:r>
+          </w:p>
+        </w:tc>
+      </w:tr>
+      <w:tr>
+        <w:tc>
+          <w:tcPr>
+            <w:tcW w:type="dxa" w:w="2160"/>
+          </w:tcPr>
+          <w:p>
+            <w:r>
+              <w:t>1.50 m: Lock-off load ≤ tendon limit</w:t>
+            </w:r>
+          </w:p>
+        </w:tc>
+        <w:tc>
+          <w:tcPr>
+            <w:tcW w:type="dxa" w:w="2160"/>
+          </w:tcPr>
+          <w:p>
+            <w:r>
+              <w:t>329.69</w:t>
+            </w:r>
+          </w:p>
+        </w:tc>
+        <w:tc>
+          <w:tcPr>
+            <w:tcW w:type="dxa" w:w="2160"/>
+          </w:tcPr>
+          <w:p>
+            <w:r>
+              <w:t>547.47</w:t>
+            </w:r>
+          </w:p>
+        </w:tc>
+        <w:tc>
+          <w:tcPr>
+            <w:tcW w:type="dxa" w:w="2160"/>
+          </w:tcPr>
+          <w:p>
+            <w:r>
+              <w:t>Pass</w:t>
+            </w:r>
+          </w:p>
+        </w:tc>
+      </w:tr>
+      <w:tr>
+        <w:tc>
+          <w:tcPr>
+            <w:tcW w:type="dxa" w:w="2160"/>
+          </w:tcPr>
+          <w:p>
+            <w:r>
+              <w:t>1.50 m: Test load ≤ tendon limit</w:t>
+            </w:r>
+          </w:p>
+        </w:tc>
+        <w:tc>
+          <w:tcPr>
+            <w:tcW w:type="dxa" w:w="2160"/>
+          </w:tcPr>
+          <w:p>
+            <w:r>
+              <w:t>438.48</w:t>
+            </w:r>
+          </w:p>
+        </w:tc>
+        <w:tc>
+          <w:tcPr>
+            <w:tcW w:type="dxa" w:w="2160"/>
+          </w:tcPr>
+          <w:p>
+            <w:r>
+              <w:t>625.68</w:t>
+            </w:r>
+          </w:p>
+        </w:tc>
+        <w:tc>
+          <w:tcPr>
+            <w:tcW w:type="dxa" w:w="2160"/>
+          </w:tcPr>
+          <w:p>
+            <w:r>
+              <w:t>Pass</w:t>
+            </w:r>
+          </w:p>
+        </w:tc>
+      </w:tr>
+      <w:tr>
+        <w:tc>
+          <w:tcPr>
+            <w:tcW w:type="dxa" w:w="2160"/>
+          </w:tcPr>
+          <w:p>
+            <w:r>
+              <w:t>1.50 m: Minimum cover over the bond zone centre</w:t>
+            </w:r>
+          </w:p>
+        </w:tc>
+        <w:tc>
+          <w:tcPr>
+            <w:tcW w:type="dxa" w:w="2160"/>
+          </w:tcPr>
+          <w:p>
+            <w:r>
+              <w:t>4.50</w:t>
+            </w:r>
+          </w:p>
+        </w:tc>
+        <w:tc>
+          <w:tcPr>
+            <w:tcW w:type="dxa" w:w="2160"/>
+          </w:tcPr>
+          <w:p>
+            <w:r>
+              <w:t>1.50</w:t>
+            </w:r>
+          </w:p>
+        </w:tc>
+        <w:tc>
+          <w:tcPr>
+            <w:tcW w:type="dxa" w:w="2160"/>
+          </w:tcPr>
+          <w:p>
+            <w:r>
+              <w:t>Fail</w:t>
+            </w:r>
+          </w:p>
+        </w:tc>
+      </w:tr>
+      <w:tr>
+        <w:tc>
+          <w:tcPr>
+            <w:tcW w:type="dxa" w:w="2160"/>
+          </w:tcPr>
+          <w:p>
+            <w:r>
+              <w:t>4.50 m: Design load ≤ tendon limit</w:t>
+            </w:r>
+          </w:p>
+        </w:tc>
+        <w:tc>
+          <w:tcPr>
+            <w:tcW w:type="dxa" w:w="2160"/>
+          </w:tcPr>
+          <w:p>
+            <w:r>
+              <w:t>339.06</w:t>
+            </w:r>
+          </w:p>
+        </w:tc>
+        <w:tc>
+          <w:tcPr>
+            <w:tcW w:type="dxa" w:w="2160"/>
+          </w:tcPr>
+          <w:p>
+            <w:r>
+              <w:t>469.26</w:t>
+            </w:r>
+          </w:p>
+        </w:tc>
+        <w:tc>
+          <w:tcPr>
+            <w:tcW w:type="dxa" w:w="2160"/>
+          </w:tcPr>
+          <w:p>
+            <w:r>
+              <w:t>Pass</w:t>
+            </w:r>
+          </w:p>
+        </w:tc>
+      </w:tr>
+      <w:tr>
+        <w:tc>
+          <w:tcPr>
+            <w:tcW w:type="dxa" w:w="2160"/>
+          </w:tcPr>
+          <w:p>
+            <w:r>
+              <w:t>4.50 m: Lock-off load ≤ tendon limit</w:t>
+            </w:r>
+          </w:p>
+        </w:tc>
+        <w:tc>
+          <w:tcPr>
+            <w:tcW w:type="dxa" w:w="2160"/>
+          </w:tcPr>
+          <w:p>
+            <w:r>
+              <w:t>339.06</w:t>
+            </w:r>
+          </w:p>
+        </w:tc>
+        <w:tc>
+          <w:tcPr>
+            <w:tcW w:type="dxa" w:w="2160"/>
+          </w:tcPr>
+          <w:p>
+            <w:r>
+              <w:t>547.47</w:t>
+            </w:r>
+          </w:p>
+        </w:tc>
+        <w:tc>
+          <w:tcPr>
+            <w:tcW w:type="dxa" w:w="2160"/>
+          </w:tcPr>
+          <w:p>
+            <w:r>
+              <w:t>Pass</w:t>
+            </w:r>
+          </w:p>
+        </w:tc>
+      </w:tr>
+      <w:tr>
+        <w:tc>
+          <w:tcPr>
+            <w:tcW w:type="dxa" w:w="2160"/>
+          </w:tcPr>
+          <w:p>
+            <w:r>
+              <w:t>4.50 m: Test load ≤ tendon limit</w:t>
+            </w:r>
+          </w:p>
+        </w:tc>
+        <w:tc>
+          <w:tcPr>
+            <w:tcW w:type="dxa" w:w="2160"/>
+          </w:tcPr>
+          <w:p>
+            <w:r>
+              <w:t>450.95</w:t>
+            </w:r>
+          </w:p>
+        </w:tc>
+        <w:tc>
+          <w:tcPr>
+            <w:tcW w:type="dxa" w:w="2160"/>
+          </w:tcPr>
+          <w:p>
+            <w:r>
+              <w:t>625.68</w:t>
+            </w:r>
+          </w:p>
+        </w:tc>
+        <w:tc>
+          <w:tcPr>
+            <w:tcW w:type="dxa" w:w="2160"/>
+          </w:tcPr>
+          <w:p>
+            <w:r>
+              <w:t>Pass</w:t>
+            </w:r>
+          </w:p>
+        </w:tc>
+      </w:tr>
+      <w:tr>
+        <w:tc>
+          <w:tcPr>
+            <w:tcW w:type="dxa" w:w="2160"/>
+          </w:tcPr>
+          <w:p>
+            <w:r>
+              <w:t>4.50 m: Minimum cover over the bond zone centre</w:t>
+            </w:r>
+          </w:p>
+        </w:tc>
+        <w:tc>
+          <w:tcPr>
+            <w:tcW w:type="dxa" w:w="2160"/>
+          </w:tcPr>
+          <w:p>
+            <w:r>
+              <w:t>4.50</w:t>
+            </w:r>
+          </w:p>
+        </w:tc>
+        <w:tc>
+          <w:tcPr>
+            <w:tcW w:type="dxa" w:w="2160"/>
+          </w:tcPr>
+          <w:p>
+            <w:r>
+              <w:t>4.50</w:t>
+            </w:r>
+          </w:p>
+        </w:tc>
+        <w:tc>
+          <w:tcPr>
+            <w:tcW w:type="dxa" w:w="2160"/>
+          </w:tcPr>
+          <w:p>
+            <w:r>
+              <w:t>Pass</w:t>
+            </w:r>
+          </w:p>
+        </w:tc>
+      </w:tr>
+      <w:tr>
+        <w:tc>
+          <w:tcPr>
+            <w:tcW w:type="dxa" w:w="2160"/>
+          </w:tcPr>
+          <w:p>
+            <w:r>
+              <w:t>7.50 m: Design load ≤ tendon limit</w:t>
+            </w:r>
+          </w:p>
+        </w:tc>
+        <w:tc>
+          <w:tcPr>
+            <w:tcW w:type="dxa" w:w="2160"/>
+          </w:tcPr>
+          <w:p>
+            <w:r>
+              <w:t>311.46</w:t>
+            </w:r>
+          </w:p>
+        </w:tc>
+        <w:tc>
+          <w:tcPr>
+            <w:tcW w:type="dxa" w:w="2160"/>
+          </w:tcPr>
+          <w:p>
+            <w:r>
+              <w:t>312.84</w:t>
+            </w:r>
+          </w:p>
+        </w:tc>
+        <w:tc>
+          <w:tcPr>
+            <w:tcW w:type="dxa" w:w="2160"/>
+          </w:tcPr>
+          <w:p>
+            <w:r>
+              <w:t>Pass</w:t>
+            </w:r>
+          </w:p>
+        </w:tc>
+      </w:tr>
+      <w:tr>
+        <w:tc>
+          <w:tcPr>
+            <w:tcW w:type="dxa" w:w="2160"/>
+          </w:tcPr>
+          <w:p>
+            <w:r>
+              <w:t>7.50 m: Lock-off load ≤ tendon limit</w:t>
+            </w:r>
+          </w:p>
+        </w:tc>
+        <w:tc>
+          <w:tcPr>
+            <w:tcW w:type="dxa" w:w="2160"/>
+          </w:tcPr>
+          <w:p>
+            <w:r>
+              <w:t>311.46</w:t>
+            </w:r>
+          </w:p>
+        </w:tc>
+        <w:tc>
+          <w:tcPr>
+            <w:tcW w:type="dxa" w:w="2160"/>
+          </w:tcPr>
+          <w:p>
+            <w:r>
+              <w:t>364.98</w:t>
+            </w:r>
+          </w:p>
+        </w:tc>
+        <w:tc>
+          <w:tcPr>
+            <w:tcW w:type="dxa" w:w="2160"/>
+          </w:tcPr>
+          <w:p>
+            <w:r>
+              <w:t>Pass</w:t>
+            </w:r>
+          </w:p>
+        </w:tc>
+      </w:tr>
+      <w:tr>
+        <w:tc>
+          <w:tcPr>
+            <w:tcW w:type="dxa" w:w="2160"/>
+          </w:tcPr>
+          <w:p>
+            <w:r>
+              <w:t>7.50 m: Test load ≤ tendon limit</w:t>
+            </w:r>
+          </w:p>
+        </w:tc>
+        <w:tc>
+          <w:tcPr>
+            <w:tcW w:type="dxa" w:w="2160"/>
+          </w:tcPr>
+          <w:p>
+            <w:r>
+              <w:t>414.24</w:t>
+            </w:r>
+          </w:p>
+        </w:tc>
+        <w:tc>
+          <w:tcPr>
+            <w:tcW w:type="dxa" w:w="2160"/>
+          </w:tcPr>
+          <w:p>
+            <w:r>
+              <w:t>417.12</w:t>
+            </w:r>
+          </w:p>
+        </w:tc>
+        <w:tc>
+          <w:tcPr>
+            <w:tcW w:type="dxa" w:w="2160"/>
+          </w:tcPr>
+          <w:p>
+            <w:r>
+              <w:t>Pass</w:t>
+            </w:r>
+          </w:p>
+        </w:tc>
+      </w:tr>
+      <w:tr>
+        <w:tc>
+          <w:tcPr>
+            <w:tcW w:type="dxa" w:w="2160"/>
+          </w:tcPr>
+          <w:p>
+            <w:r>
+              <w:t>7.50 m: Minimum cover over the bond zone centre</w:t>
+            </w:r>
+          </w:p>
+        </w:tc>
+        <w:tc>
+          <w:tcPr>
+            <w:tcW w:type="dxa" w:w="2160"/>
+          </w:tcPr>
+          <w:p>
+            <w:r>
+              <w:t>4.50</w:t>
+            </w:r>
+          </w:p>
+        </w:tc>
+        <w:tc>
+          <w:tcPr>
+            <w:tcW w:type="dxa" w:w="2160"/>
+          </w:tcPr>
+          <w:p>
+            <w:r>
+              <w:t>7.50</w:t>
+            </w:r>
+          </w:p>
+        </w:tc>
+        <w:tc>
+          <w:tcPr>
+            <w:tcW w:type="dxa" w:w="2160"/>
+          </w:tcPr>
+          <w:p>
+            <w:r>
+              <w:t>Pass</w:t>
             </w:r>
           </w:p>
         </w:tc>
@@ -5939,23 +6851,7 @@
         <w:pStyle w:val="ListBullet"/>
       </w:pPr>
       <w:r>
-        <w:t>Embedment is from moment equilibrium only; the toe force residual 349.8 kN/m is not balanced and is excluded from the shear maximum.</w:t>
-      </w:r>
-    </w:p>
-    <w:p>
-      <w:pPr>
-        <w:pStyle w:val="ListBullet"/>
-      </w:pPr>
-      <w:r>
-        <w:t>Several anchor levels: empirical apparent pressure envelope (sand) for level ground (Terzaghi-Peck, Peck 1969, FHWA GEC-4 ch. 5).</w:t>
-      </w:r>
-    </w:p>
-    <w:p>
-      <w:pPr>
-        <w:pStyle w:val="ListBullet"/>
-      </w:pPr>
-      <w:r>
-        <w:t>The envelope shapes and the hinge method were checked against a course summary of Peck's diagrams, not the original figures; verify before design use.</w:t>
+        <w:t>Apparent pressure envelope (sand), level ground: FHWA GEC-4 5.2.4–5.2.6 (sand and stiff clay trapezoid, figures 24 and 27; soft clay figure 23c). The method is empirical.</w:t>
       </w:r>
     </w:p>
     <w:p>
@@ -5971,7 +6867,7 @@
         <w:pStyle w:val="ListBullet"/>
       </w:pPr>
       <w:r>
-        <w:t>Embedment from moments about the toe under the base reaction R_B and the net pressure below the base (factored passive).</w:t>
+        <w:t>Embedment: moment equilibrium about the toe under the base reaction R_B and the net pressure below the base (passive divided by the given factor of safety). This is deeper than the GEC-4 5.5.3 force criterion.</w:t>
       </w:r>
     </w:p>
     <w:p>
@@ -6003,7 +6899,7 @@
         <w:pStyle w:val="ListBullet"/>
       </w:pPr>
       <w:r>
-        <w:t>The bond zone starts 2.0 m behind the failure surface: max(1.5 m, 0.2 H) (GEC-4 5.3.4 says H/5 or 1.5 m; the larger is taken).</w:t>
+        <w:t>1.50 m: The bond zone starts 2.0 m beyond the failure surface, measured normal to the surface (GEC-4 figure 37a: χ = 1.5 m or 0.2H, whichever is greater).</w:t>
       </w:r>
     </w:p>
     <w:p>
@@ -6011,7 +6907,7 @@
         <w:pStyle w:val="ListBullet"/>
       </w:pPr>
       <w:r>
-        <w:t>Minimum unbonded length 4.5 m assumed (strand) (GEC-4 5.3.4).</w:t>
+        <w:t>1.50 m: Minimum unbonded length 4.5 m assumed (strand) (GEC-4 5.3.4).</w:t>
       </w:r>
     </w:p>
     <w:p>
@@ -6019,7 +6915,7 @@
         <w:pStyle w:val="ListBullet"/>
       </w:pPr>
       <w:r>
-        <w:t>The failure surface starts at the excavation base corner (GEC-4 5.3.2).</w:t>
+        <w:t>1.50 m: The failure surface starts at the excavation base corner (GEC-4 5.3.2).</w:t>
       </w:r>
     </w:p>
     <w:p>
@@ -6027,7 +6923,7 @@
         <w:pStyle w:val="ListBullet"/>
       </w:pPr>
       <w:r>
-        <w:t>Level retained ground and a vertical wall face are assumed; sloping ground is not supported yet.</w:t>
+        <w:t>1.50 m: Level retained ground and a vertical wall face are assumed; sloping ground is not supported yet.</w:t>
       </w:r>
     </w:p>
     <w:p>
@@ -6035,7 +6931,7 @@
         <w:pStyle w:val="ListBullet"/>
       </w:pPr>
       <w:r>
-        <w:t>Maximum test load = 1.33 × design load (GEC-4 pp. 75-77).</w:t>
+        <w:t>1.50 m: Maximum test load = 1.33 × design load (GEC-4 pp. 75-77).</w:t>
       </w:r>
     </w:p>
     <w:p>
@@ -6043,7 +6939,127 @@
         <w:pStyle w:val="ListBullet"/>
       </w:pPr>
       <w:r>
-        <w:t>Tendon limits 0.6 / 0.7 / 0.8 SMTS (design / lock-off / test), GEC-4 p. 77.</w:t>
+        <w:t>1.50 m: Tendon limits 0.6 / 0.7 / 0.8 SMTS (design / lock-off / test), GEC-4 p. 77.</w:t>
+      </w:r>
+    </w:p>
+    <w:p>
+      <w:pPr>
+        <w:pStyle w:val="ListBullet"/>
+      </w:pPr>
+      <w:r>
+        <w:t>1.50 m: Minimum bond length 4.5 m (soil, strand) applied (GEC-4 appendix E, 3B).</w:t>
+      </w:r>
+    </w:p>
+    <w:p>
+      <w:pPr>
+        <w:pStyle w:val="ListBullet"/>
+      </w:pPr>
+      <w:r>
+        <w:t>4.50 m: The bond zone starts 2.0 m beyond the failure surface, measured normal to the surface (GEC-4 figure 37a: χ = 1.5 m or 0.2H, whichever is greater).</w:t>
+      </w:r>
+    </w:p>
+    <w:p>
+      <w:pPr>
+        <w:pStyle w:val="ListBullet"/>
+      </w:pPr>
+      <w:r>
+        <w:t>4.50 m: Minimum unbonded length 4.5 m assumed (strand) (GEC-4 5.3.4).</w:t>
+      </w:r>
+    </w:p>
+    <w:p>
+      <w:pPr>
+        <w:pStyle w:val="ListBullet"/>
+      </w:pPr>
+      <w:r>
+        <w:t>4.50 m: The failure surface starts at the excavation base corner (GEC-4 5.3.2).</w:t>
+      </w:r>
+    </w:p>
+    <w:p>
+      <w:pPr>
+        <w:pStyle w:val="ListBullet"/>
+      </w:pPr>
+      <w:r>
+        <w:t>4.50 m: Level retained ground and a vertical wall face are assumed; sloping ground is not supported yet.</w:t>
+      </w:r>
+    </w:p>
+    <w:p>
+      <w:pPr>
+        <w:pStyle w:val="ListBullet"/>
+      </w:pPr>
+      <w:r>
+        <w:t>4.50 m: Maximum test load = 1.33 × design load (GEC-4 pp. 75-77).</w:t>
+      </w:r>
+    </w:p>
+    <w:p>
+      <w:pPr>
+        <w:pStyle w:val="ListBullet"/>
+      </w:pPr>
+      <w:r>
+        <w:t>4.50 m: Tendon limits 0.6 / 0.7 / 0.8 SMTS (design / lock-off / test), GEC-4 p. 77.</w:t>
+      </w:r>
+    </w:p>
+    <w:p>
+      <w:pPr>
+        <w:pStyle w:val="ListBullet"/>
+      </w:pPr>
+      <w:r>
+        <w:t>4.50 m: Minimum bond length 4.5 m (soil, strand) applied (GEC-4 appendix E, 3B).</w:t>
+      </w:r>
+    </w:p>
+    <w:p>
+      <w:pPr>
+        <w:pStyle w:val="ListBullet"/>
+      </w:pPr>
+      <w:r>
+        <w:t>7.50 m: The bond zone starts 2.0 m beyond the failure surface, measured normal to the surface (GEC-4 figure 37a: χ = 1.5 m or 0.2H, whichever is greater).</w:t>
+      </w:r>
+    </w:p>
+    <w:p>
+      <w:pPr>
+        <w:pStyle w:val="ListBullet"/>
+      </w:pPr>
+      <w:r>
+        <w:t>7.50 m: Minimum unbonded length 4.5 m assumed (strand) (GEC-4 5.3.4).</w:t>
+      </w:r>
+    </w:p>
+    <w:p>
+      <w:pPr>
+        <w:pStyle w:val="ListBullet"/>
+      </w:pPr>
+      <w:r>
+        <w:t>7.50 m: The failure surface starts at the excavation base corner (GEC-4 5.3.2).</w:t>
+      </w:r>
+    </w:p>
+    <w:p>
+      <w:pPr>
+        <w:pStyle w:val="ListBullet"/>
+      </w:pPr>
+      <w:r>
+        <w:t>7.50 m: Level retained ground and a vertical wall face are assumed; sloping ground is not supported yet.</w:t>
+      </w:r>
+    </w:p>
+    <w:p>
+      <w:pPr>
+        <w:pStyle w:val="ListBullet"/>
+      </w:pPr>
+      <w:r>
+        <w:t>7.50 m: Maximum test load = 1.33 × design load (GEC-4 pp. 75-77).</w:t>
+      </w:r>
+    </w:p>
+    <w:p>
+      <w:pPr>
+        <w:pStyle w:val="ListBullet"/>
+      </w:pPr>
+      <w:r>
+        <w:t>7.50 m: Tendon limits 0.6 / 0.7 / 0.8 SMTS (design / lock-off / test), GEC-4 p. 77.</w:t>
+      </w:r>
+    </w:p>
+    <w:p>
+      <w:pPr>
+        <w:pStyle w:val="ListBullet"/>
+      </w:pPr>
+      <w:r>
+        <w:t>7.50 m: Minimum bond length 4.5 m (soil, strand) applied (GEC-4 appendix E, 3B).</w:t>
       </w:r>
     </w:p>
     <w:p>
@@ -6059,7 +7075,7 @@
         <w:pStyle w:val="ListBullet"/>
       </w:pPr>
       <w:r>
-        <w:t>No source was given for the load transfer / bond value; presumptive values must be verified by anchor tests.</w:t>
+        <w:t>External (global) stability and deep-seated (Kranz) failure are not checked. Analyse slip surfaces passing behind and through the anchors separately by limit equilibrium; GEC-4 5.8.3 requires FS ≥ 1.3 (1.5 for critical permanent works).</w:t>
       </w:r>
     </w:p>
     <w:p>
@@ -6067,7 +7083,7 @@
         <w:pStyle w:val="ListBullet"/>
       </w:pPr>
       <w:r>
-        <w:t>Inclination 0.0° is outside the usual GEC-4 range of 10.0°–45.0°.</w:t>
+        <w:t>Embedment comes from moment equilibrium about the toe (deeper than the GEC-4 5.5.3 force criterion, on the safe side). A toe force residual of 290.4 kN/m is not balanced and is not included in the shear maximum; assess it separately for the embedded section.</w:t>
       </w:r>
     </w:p>
     <w:p>
@@ -6075,7 +7091,7 @@
         <w:pStyle w:val="ListBullet"/>
       </w:pPr>
       <w:r>
-        <w:t>Cover over the bond zone centre is 1.5 m; at least 4.5 m is required (GEC-4 5.3.7).</w:t>
+        <w:t>The anchor free length uses the 45° + φ′/2 planar wedge. Per GEC-4 5.3.2 this applies to uniform cohesionless soil with a level surface; with layering, clay or surcharge find the critical surface separately by trial wedge / limit equilibrium.</w:t>
       </w:r>
     </w:p>
     <w:p>
@@ -6083,7 +7099,63 @@
         <w:pStyle w:val="ListBullet"/>
       </w:pPr>
       <w:r>
-        <w:t>2 strands is not listed in GEC-4 Table 10; capacity is taken as a multiple of one strand.</w:t>
+        <w:t>1.50 m: No source was given for the load transfer / bond value; presumptive values must be verified by anchor tests.</w:t>
+      </w:r>
+    </w:p>
+    <w:p>
+      <w:pPr>
+        <w:pStyle w:val="ListBullet"/>
+      </w:pPr>
+      <w:r>
+        <w:t>1.50 m: Inclination 0.0° is outside the usual GEC-4 range of 10.0°–45.0°.</w:t>
+      </w:r>
+    </w:p>
+    <w:p>
+      <w:pPr>
+        <w:pStyle w:val="ListBullet"/>
+      </w:pPr>
+      <w:r>
+        <w:t>1.50 m: Cover over the bond zone centre is 1.5 m; at least 4.5 m is required (GEC-4 5.3.7).</w:t>
+      </w:r>
+    </w:p>
+    <w:p>
+      <w:pPr>
+        <w:pStyle w:val="ListBullet"/>
+      </w:pPr>
+      <w:r>
+        <w:t>4.50 m: No source was given for the load transfer / bond value; presumptive values must be verified by anchor tests.</w:t>
+      </w:r>
+    </w:p>
+    <w:p>
+      <w:pPr>
+        <w:pStyle w:val="ListBullet"/>
+      </w:pPr>
+      <w:r>
+        <w:t>4.50 m: Inclination 0.0° is outside the usual GEC-4 range of 10.0°–45.0°.</w:t>
+      </w:r>
+    </w:p>
+    <w:p>
+      <w:pPr>
+        <w:pStyle w:val="ListBullet"/>
+      </w:pPr>
+      <w:r>
+        <w:t>7.50 m: No source was given for the load transfer / bond value; presumptive values must be verified by anchor tests.</w:t>
+      </w:r>
+    </w:p>
+    <w:p>
+      <w:pPr>
+        <w:pStyle w:val="ListBullet"/>
+      </w:pPr>
+      <w:r>
+        <w:t>7.50 m: 2 strands is not listed in GEC-4 Table 10; capacity is taken as a multiple of one strand.</w:t>
+      </w:r>
+    </w:p>
+    <w:p>
+      <w:pPr>
+        <w:pStyle w:val="ListBullet"/>
+      </w:pPr>
+      <w:r>
+        <w:t>7.50 m: Inclination 0.0° is outside the usual GEC-4 range of 10.0°–45.0°.</w:t>
       </w:r>
     </w:p>
     <w:p>
@@ -6099,7 +7171,7 @@
         <w:pStyle w:val="ListBullet"/>
       </w:pPr>
       <w:r>
-        <w:t>Terzaghi and Peck (1967) Soil Mechanics in Engineering Practice; Peck (1969) 7th ICSMFE</w:t>
+        <w:t>FHWA GEC-4 (FHWA-IF-99-015) 5.2.4-5.2.6, figures 23, 24, 27-29, eq. 9-12 (apparent earth pressure envelopes)</w:t>
       </w:r>
     </w:p>
     <w:p>
@@ -6107,7 +7179,7 @@
         <w:pStyle w:val="ListBullet"/>
       </w:pPr>
       <w:r>
-        <w:t>FHWA GEC-4 (FHWA-IF-99-015) ch. 5, apparent pressure envelopes and hinge/tributary methods</w:t>
+        <w:t>FHWA GEC-4 (FHWA-IF-99-015) 5.3.3, figures 33-34 (hinge and tributary methods), 5.4.1 (wall moments)</w:t>
       </w:r>
     </w:p>
     <w:p>
@@ -6115,7 +7187,15 @@
         <w:pStyle w:val="ListBullet"/>
       </w:pPr>
       <w:r>
-        <w:t>USS Steel Sheet Piling Design Manual; USACE EM 1110-2-2504 (free earth support)</w:t>
+        <w:t>FHWA GEC-4 (FHWA-IF-99-015) 5.5.3 (embedment; passive factor of safety)</w:t>
+      </w:r>
+    </w:p>
+    <w:p>
+      <w:pPr>
+        <w:pStyle w:val="ListBullet"/>
+      </w:pPr>
+      <w:r>
+        <w:t>FHWA GEC-4 (FHWA-IF-99-015) 5.8.3 (external stability: not analysed, check separately)</w:t>
       </w:r>
     </w:p>
     <w:sectPr>

</xml_diff>

<commit_message>
Ankraj ve ankrajlı iksa: GEC-4'e göre mühendislik düzeltmeleri (#26)
- Yumuşak kil zarfı: 4 < Ns < 5,14 için Ka = 0,22, Ns >= 5,14 için Henkel (GEC-4 5.2.6)
- Kilde taban kabarması kontrolü (GEC-4 5.8.2.2, denk. 34-37); B ve yapı türü zorunlu
- Kum ve sert kilde GEC-4 trapez zarfı (Şekil 24, 27), sert kilde en az 3H²
- Tek seviyede serbest zemin desteği ile GEC-4 zarfının büyüğü
- Ankraj: χ kayma yüzeyine dik, en küçük kök boyu, kayada FS 3,0, aralık uyarısı
- Pasif güvenlik sayısı zorunlu girdi; dış stabilite için zorunlu uyarı
- Web/rapor: kil girdileri, seviye kontrolleri, profil bayatlığı, rapor girdileri, metinler
- docs/qa/ankraj-muhendislik-kontrolu.md


Claude-Session: https://claude.ai/code/session_0164Y5cX1GYfYdpR8gu6bezQ

Co-authored-by: Claude <noreply@anthropic.com>
</commit_message>
<xml_diff>
--- a/docs/qa/g8/rapor_en.docx
+++ b/docs/qa/g8/rapor_en.docx
@@ -5167,7 +5167,7 @@
           </w:tcPr>
           <w:p>
             <w:r>
-              <w:t>Passive factor of safety</w:t>
+              <w:t>Surcharge basis</w:t>
             </w:r>
           </w:p>
         </w:tc>
@@ -5177,7 +5177,7 @@
           </w:tcPr>
           <w:p>
             <w:r>
-              <w:t>1.50</w:t>
+              <w:t>Per horizontal projection</w:t>
             </w:r>
           </w:p>
         </w:tc>
@@ -5189,7 +5189,7 @@
           </w:tcPr>
           <w:p>
             <w:r>
-              <w:t>Method</w:t>
+              <w:t>Passive factor of safety</w:t>
             </w:r>
           </w:p>
         </w:tc>
@@ -5199,7 +5199,7 @@
           </w:tcPr>
           <w:p>
             <w:r>
-              <w:t>Apparent pressure, hinge method</w:t>
+              <w:t>1.50</w:t>
             </w:r>
           </w:p>
         </w:tc>
@@ -5211,7 +5211,7 @@
           </w:tcPr>
           <w:p>
             <w:r>
-              <w:t>Theoretical embedment D0 (m)</w:t>
+              <w:t>Embedment increase</w:t>
             </w:r>
           </w:p>
         </w:tc>
@@ -5221,7 +5221,7 @@
           </w:tcPr>
           <w:p>
             <w:r>
-              <w:t>7.71</w:t>
+              <w:t>—</w:t>
             </w:r>
           </w:p>
         </w:tc>
@@ -5233,7 +5233,7 @@
           </w:tcPr>
           <w:p>
             <w:r>
-              <w:t>Design embedment D (m)</w:t>
+              <w:t>Allowable stress (MPa)</w:t>
             </w:r>
           </w:p>
         </w:tc>
@@ -5243,7 +5243,7 @@
           </w:tcPr>
           <w:p>
             <w:r>
-              <w:t>9.25</w:t>
+              <w:t>—</w:t>
             </w:r>
           </w:p>
         </w:tc>
@@ -5255,7 +5255,7 @@
           </w:tcPr>
           <w:p>
             <w:r>
-              <w:t>Wall length (m)</w:t>
+              <w:t>Method</w:t>
             </w:r>
           </w:p>
         </w:tc>
@@ -5265,7 +5265,7 @@
           </w:tcPr>
           <w:p>
             <w:r>
-              <w:t>19.25</w:t>
+              <w:t>Apparent pressure, hinge method</w:t>
             </w:r>
           </w:p>
         </w:tc>
@@ -5277,7 +5277,7 @@
           </w:tcPr>
           <w:p>
             <w:r>
-              <w:t>Base reaction R_B (kN/m)</w:t>
+              <w:t>Theoretical embedment D0 (m)</w:t>
             </w:r>
           </w:p>
         </w:tc>
@@ -5287,7 +5287,7 @@
           </w:tcPr>
           <w:p>
             <w:r>
-              <w:t>52.9</w:t>
+              <w:t>7.20</w:t>
             </w:r>
           </w:p>
         </w:tc>
@@ -5299,7 +5299,7 @@
           </w:tcPr>
           <w:p>
             <w:r>
-              <w:t>Max moment (kNm/m)</w:t>
+              <w:t>Design embedment D (m)</w:t>
             </w:r>
           </w:p>
         </w:tc>
@@ -5309,7 +5309,7 @@
           </w:tcPr>
           <w:p>
             <w:r>
-              <w:t>431.4</w:t>
+              <w:t>8.64</w:t>
             </w:r>
           </w:p>
         </w:tc>
@@ -5321,7 +5321,7 @@
           </w:tcPr>
           <w:p>
             <w:r>
-              <w:t>Max shear (kN/m)</w:t>
+              <w:t>Wall length (m)</w:t>
             </w:r>
           </w:p>
         </w:tc>
@@ -5331,7 +5331,7 @@
           </w:tcPr>
           <w:p>
             <w:r>
-              <w:t>119.8</w:t>
+              <w:t>18.64</w:t>
             </w:r>
           </w:p>
         </w:tc>
@@ -5343,7 +5343,343 @@
           </w:tcPr>
           <w:p>
             <w:r>
-              <w:t>Required section modulus (cm³)</w:t>
+              <w:t>Base reaction R_B (kN/m)</w:t>
+            </w:r>
+          </w:p>
+        </w:tc>
+        <w:tc>
+          <w:tcPr>
+            <w:tcW w:type="dxa" w:w="4320"/>
+          </w:tcPr>
+          <w:p>
+            <w:r>
+              <w:t>31.2</w:t>
+            </w:r>
+          </w:p>
+        </w:tc>
+      </w:tr>
+      <w:tr>
+        <w:tc>
+          <w:tcPr>
+            <w:tcW w:type="dxa" w:w="4320"/>
+          </w:tcPr>
+          <w:p>
+            <w:r>
+              <w:t>Max moment (kNm/m)</w:t>
+            </w:r>
+          </w:p>
+        </w:tc>
+        <w:tc>
+          <w:tcPr>
+            <w:tcW w:type="dxa" w:w="4320"/>
+          </w:tcPr>
+          <w:p>
+            <w:r>
+              <w:t>327.3</w:t>
+            </w:r>
+          </w:p>
+        </w:tc>
+      </w:tr>
+      <w:tr>
+        <w:tc>
+          <w:tcPr>
+            <w:tcW w:type="dxa" w:w="4320"/>
+          </w:tcPr>
+          <w:p>
+            <w:r>
+              <w:t>Max shear (kN/m)</w:t>
+            </w:r>
+          </w:p>
+        </w:tc>
+        <w:tc>
+          <w:tcPr>
+            <w:tcW w:type="dxa" w:w="4320"/>
+          </w:tcPr>
+          <w:p>
+            <w:r>
+              <w:t>98.1</w:t>
+            </w:r>
+          </w:p>
+        </w:tc>
+      </w:tr>
+      <w:tr>
+        <w:tc>
+          <w:tcPr>
+            <w:tcW w:type="dxa" w:w="4320"/>
+          </w:tcPr>
+          <w:p>
+            <w:r>
+              <w:t>Required section modulus (cm³) (cm³/m)</w:t>
+            </w:r>
+          </w:p>
+        </w:tc>
+        <w:tc>
+          <w:tcPr>
+            <w:tcW w:type="dxa" w:w="4320"/>
+          </w:tcPr>
+          <w:p>
+            <w:r>
+              <w:t>—</w:t>
+            </w:r>
+          </w:p>
+        </w:tc>
+      </w:tr>
+    </w:tbl>
+    <w:p/>
+    <w:p>
+      <w:pPr>
+        <w:pStyle w:val="Heading3"/>
+      </w:pPr>
+      <w:r>
+        <w:t>Design the anchors of every level</w:t>
+      </w:r>
+    </w:p>
+    <w:tbl>
+      <w:tblPr>
+        <w:tblStyle w:val="TableGrid"/>
+        <w:tblW w:type="auto" w:w="0"/>
+        <w:tblLook w:firstColumn="1" w:firstRow="1" w:lastColumn="0" w:lastRow="0" w:noHBand="0" w:noVBand="1" w:val="04A0"/>
+      </w:tblPr>
+      <w:tblGrid>
+        <w:gridCol w:w="4320"/>
+        <w:gridCol w:w="4320"/>
+      </w:tblGrid>
+      <w:tr>
+        <w:tc>
+          <w:tcPr>
+            <w:tcW w:type="dxa" w:w="4320"/>
+          </w:tcPr>
+          <w:p>
+            <w:r/>
+            <w:r>
+              <w:rPr>
+                <w:b/>
+              </w:rPr>
+              <w:t>Item</w:t>
+            </w:r>
+          </w:p>
+        </w:tc>
+        <w:tc>
+          <w:tcPr>
+            <w:tcW w:type="dxa" w:w="4320"/>
+          </w:tcPr>
+          <w:p>
+            <w:r/>
+            <w:r>
+              <w:rPr>
+                <w:b/>
+              </w:rPr>
+              <w:t>Value</w:t>
+            </w:r>
+          </w:p>
+        </w:tc>
+      </w:tr>
+      <w:tr>
+        <w:tc>
+          <w:tcPr>
+            <w:tcW w:type="dxa" w:w="4320"/>
+          </w:tcPr>
+          <w:p>
+            <w:r>
+              <w:t>Factor of safety FS (bond)</w:t>
+            </w:r>
+          </w:p>
+        </w:tc>
+        <w:tc>
+          <w:tcPr>
+            <w:tcW w:type="dxa" w:w="4320"/>
+          </w:tcPr>
+          <w:p>
+            <w:r>
+              <w:t>2.00</w:t>
+            </w:r>
+          </w:p>
+        </w:tc>
+      </w:tr>
+      <w:tr>
+        <w:tc>
+          <w:tcPr>
+            <w:tcW w:type="dxa" w:w="4320"/>
+          </w:tcPr>
+          <w:p>
+            <w:r>
+              <w:t>Load transfer used (kN/m)</w:t>
+            </w:r>
+          </w:p>
+        </w:tc>
+        <w:tc>
+          <w:tcPr>
+            <w:tcW w:type="dxa" w:w="4320"/>
+          </w:tcPr>
+          <w:p>
+            <w:r>
+              <w:t>100.0</w:t>
+            </w:r>
+          </w:p>
+        </w:tc>
+      </w:tr>
+      <w:tr>
+        <w:tc>
+          <w:tcPr>
+            <w:tcW w:type="dxa" w:w="4320"/>
+          </w:tcPr>
+          <w:p>
+            <w:r>
+              <w:t>Lock-off load ratio</w:t>
+            </w:r>
+          </w:p>
+        </w:tc>
+        <w:tc>
+          <w:tcPr>
+            <w:tcW w:type="dxa" w:w="4320"/>
+          </w:tcPr>
+          <w:p>
+            <w:r>
+              <w:t>1.00</w:t>
+            </w:r>
+          </w:p>
+        </w:tc>
+      </w:tr>
+      <w:tr>
+        <w:tc>
+          <w:tcPr>
+            <w:tcW w:type="dxa" w:w="4320"/>
+          </w:tcPr>
+          <w:p>
+            <w:r>
+              <w:t>Test load factor</w:t>
+            </w:r>
+          </w:p>
+        </w:tc>
+        <w:tc>
+          <w:tcPr>
+            <w:tcW w:type="dxa" w:w="4320"/>
+          </w:tcPr>
+          <w:p>
+            <w:r>
+              <w:t>1.33</w:t>
+            </w:r>
+          </w:p>
+        </w:tc>
+      </w:tr>
+      <w:tr>
+        <w:tc>
+          <w:tcPr>
+            <w:tcW w:type="dxa" w:w="4320"/>
+          </w:tcPr>
+          <w:p>
+            <w:r>
+              <w:t>Design load limit (× SMTS)</w:t>
+            </w:r>
+          </w:p>
+        </w:tc>
+        <w:tc>
+          <w:tcPr>
+            <w:tcW w:type="dxa" w:w="4320"/>
+          </w:tcPr>
+          <w:p>
+            <w:r>
+              <w:t>0.60</w:t>
+            </w:r>
+          </w:p>
+        </w:tc>
+      </w:tr>
+      <w:tr>
+        <w:tc>
+          <w:tcPr>
+            <w:tcW w:type="dxa" w:w="4320"/>
+          </w:tcPr>
+          <w:p>
+            <w:r>
+              <w:t>Lock-off limit (× SMTS)</w:t>
+            </w:r>
+          </w:p>
+        </w:tc>
+        <w:tc>
+          <w:tcPr>
+            <w:tcW w:type="dxa" w:w="4320"/>
+          </w:tcPr>
+          <w:p>
+            <w:r>
+              <w:t>0.70</w:t>
+            </w:r>
+          </w:p>
+        </w:tc>
+      </w:tr>
+      <w:tr>
+        <w:tc>
+          <w:tcPr>
+            <w:tcW w:type="dxa" w:w="4320"/>
+          </w:tcPr>
+          <w:p>
+            <w:r>
+              <w:t>Test load limit (× SMTS)</w:t>
+            </w:r>
+          </w:p>
+        </w:tc>
+        <w:tc>
+          <w:tcPr>
+            <w:tcW w:type="dxa" w:w="4320"/>
+          </w:tcPr>
+          <w:p>
+            <w:r>
+              <w:t>0.80</w:t>
+            </w:r>
+          </w:p>
+        </w:tc>
+      </w:tr>
+      <w:tr>
+        <w:tc>
+          <w:tcPr>
+            <w:tcW w:type="dxa" w:w="4320"/>
+          </w:tcPr>
+          <w:p>
+            <w:r>
+              <w:t>Tendon type</w:t>
+            </w:r>
+          </w:p>
+        </w:tc>
+        <w:tc>
+          <w:tcPr>
+            <w:tcW w:type="dxa" w:w="4320"/>
+          </w:tcPr>
+          <w:p>
+            <w:r>
+              <w:t>Strand</w:t>
+            </w:r>
+          </w:p>
+        </w:tc>
+      </w:tr>
+      <w:tr>
+        <w:tc>
+          <w:tcPr>
+            <w:tcW w:type="dxa" w:w="4320"/>
+          </w:tcPr>
+          <w:p>
+            <w:r>
+              <w:t>Anchor ground</w:t>
+            </w:r>
+          </w:p>
+        </w:tc>
+        <w:tc>
+          <w:tcPr>
+            <w:tcW w:type="dxa" w:w="4320"/>
+          </w:tcPr>
+          <w:p>
+            <w:r>
+              <w:t>Soil</w:t>
+            </w:r>
+          </w:p>
+        </w:tc>
+      </w:tr>
+      <w:tr>
+        <w:tc>
+          <w:tcPr>
+            <w:tcW w:type="dxa" w:w="4320"/>
+          </w:tcPr>
+          <w:p>
+            <w:r>
+              <w:t>Bond start behind wedge (m)</w:t>
             </w:r>
           </w:p>
         </w:tc>
@@ -5537,7 +5873,7 @@
         <w:rPr>
           <w:b w:val="0"/>
         </w:rPr>
-        <w:t>Apparent pressure envelope (sand): p_max = 42.3 kPa, total thrust 423.3 kN/m.</w:t>
+        <w:t>Apparent pressure envelope (sand): p_max = 48.3 kPa, total thrust 423.3 kN/m.</w:t>
       </w:r>
     </w:p>
     <w:p>
@@ -5715,7 +6051,7 @@
           </w:tcPr>
           <w:p>
             <w:r>
-              <w:t>142.9</w:t>
+              <w:t>131.9</w:t>
             </w:r>
           </w:p>
         </w:tc>
@@ -5725,7 +6061,7 @@
           </w:tcPr>
           <w:p>
             <w:r>
-              <w:t>357.2</w:t>
+              <w:t>329.7</w:t>
             </w:r>
           </w:p>
         </w:tc>
@@ -5735,7 +6071,7 @@
           </w:tcPr>
           <w:p>
             <w:r>
-              <w:t>6.91</w:t>
+              <w:t>7.22</w:t>
             </w:r>
           </w:p>
         </w:tc>
@@ -5745,7 +6081,7 @@
           </w:tcPr>
           <w:p>
             <w:r>
-              <w:t>7.14</w:t>
+              <w:t>6.59</w:t>
             </w:r>
           </w:p>
         </w:tc>
@@ -5797,7 +6133,7 @@
           </w:tcPr>
           <w:p>
             <w:r>
-              <w:t>111.1</w:t>
+              <w:t>135.6</w:t>
             </w:r>
           </w:p>
         </w:tc>
@@ -5807,7 +6143,7 @@
           </w:tcPr>
           <w:p>
             <w:r>
-              <w:t>277.8</w:t>
+              <w:t>339.1</w:t>
             </w:r>
           </w:p>
         </w:tc>
@@ -5817,7 +6153,7 @@
           </w:tcPr>
           <w:p>
             <w:r>
-              <w:t>5.18</w:t>
+              <w:t>5.48</w:t>
             </w:r>
           </w:p>
         </w:tc>
@@ -5827,7 +6163,7 @@
           </w:tcPr>
           <w:p>
             <w:r>
-              <w:t>5.56</w:t>
+              <w:t>6.78</w:t>
             </w:r>
           </w:p>
         </w:tc>
@@ -5837,7 +6173,7 @@
           </w:tcPr>
           <w:p>
             <w:r>
-              <w:t>2 × 15 mm strand, ASTM A416 Gr 270 (metric 1860)</w:t>
+              <w:t>3 × 15 mm strand, ASTM A416 Gr 270 (metric 1860)</w:t>
             </w:r>
           </w:p>
         </w:tc>
@@ -5879,7 +6215,7 @@
           </w:tcPr>
           <w:p>
             <w:r>
-              <w:t>116.4</w:t>
+              <w:t>124.6</w:t>
             </w:r>
           </w:p>
         </w:tc>
@@ -5889,7 +6225,7 @@
           </w:tcPr>
           <w:p>
             <w:r>
-              <w:t>291.0</w:t>
+              <w:t>311.5</w:t>
             </w:r>
           </w:p>
         </w:tc>
@@ -5909,7 +6245,7 @@
           </w:tcPr>
           <w:p>
             <w:r>
-              <w:t>5.82</w:t>
+              <w:t>6.23</w:t>
             </w:r>
           </w:p>
         </w:tc>
@@ -5920,6 +6256,582 @@
           <w:p>
             <w:r>
               <w:t>2 × 15 mm strand, ASTM A416 Gr 270 (metric 1860)</w:t>
+            </w:r>
+          </w:p>
+        </w:tc>
+      </w:tr>
+    </w:tbl>
+    <w:p/>
+    <w:tbl>
+      <w:tblPr>
+        <w:tblStyle w:val="TableGrid"/>
+        <w:tblW w:type="auto" w:w="0"/>
+        <w:tblLook w:firstColumn="1" w:firstRow="1" w:lastColumn="0" w:lastRow="0" w:noHBand="0" w:noVBand="1" w:val="04A0"/>
+      </w:tblPr>
+      <w:tblGrid>
+        <w:gridCol w:w="2160"/>
+        <w:gridCol w:w="2160"/>
+        <w:gridCol w:w="2160"/>
+        <w:gridCol w:w="2160"/>
+      </w:tblGrid>
+      <w:tr>
+        <w:tc>
+          <w:tcPr>
+            <w:tcW w:type="dxa" w:w="2160"/>
+          </w:tcPr>
+          <w:p>
+            <w:r/>
+            <w:r>
+              <w:rPr>
+                <w:b/>
+              </w:rPr>
+              <w:t>Check</w:t>
+            </w:r>
+          </w:p>
+        </w:tc>
+        <w:tc>
+          <w:tcPr>
+            <w:tcW w:type="dxa" w:w="2160"/>
+          </w:tcPr>
+          <w:p>
+            <w:r/>
+            <w:r>
+              <w:rPr>
+                <w:b/>
+              </w:rPr>
+              <w:t>Demand</w:t>
+            </w:r>
+          </w:p>
+        </w:tc>
+        <w:tc>
+          <w:tcPr>
+            <w:tcW w:type="dxa" w:w="2160"/>
+          </w:tcPr>
+          <w:p>
+            <w:r/>
+            <w:r>
+              <w:rPr>
+                <w:b/>
+              </w:rPr>
+              <w:t>Limit</w:t>
+            </w:r>
+          </w:p>
+        </w:tc>
+        <w:tc>
+          <w:tcPr>
+            <w:tcW w:type="dxa" w:w="2160"/>
+          </w:tcPr>
+          <w:p>
+            <w:r/>
+            <w:r>
+              <w:rPr>
+                <w:b/>
+              </w:rPr>
+              <w:t>Result</w:t>
+            </w:r>
+          </w:p>
+        </w:tc>
+      </w:tr>
+      <w:tr>
+        <w:tc>
+          <w:tcPr>
+            <w:tcW w:type="dxa" w:w="2160"/>
+          </w:tcPr>
+          <w:p>
+            <w:r>
+              <w:t>1.50 m: Design load ≤ tendon limit</w:t>
+            </w:r>
+          </w:p>
+        </w:tc>
+        <w:tc>
+          <w:tcPr>
+            <w:tcW w:type="dxa" w:w="2160"/>
+          </w:tcPr>
+          <w:p>
+            <w:r>
+              <w:t>329.69</w:t>
+            </w:r>
+          </w:p>
+        </w:tc>
+        <w:tc>
+          <w:tcPr>
+            <w:tcW w:type="dxa" w:w="2160"/>
+          </w:tcPr>
+          <w:p>
+            <w:r>
+              <w:t>469.26</w:t>
+            </w:r>
+          </w:p>
+        </w:tc>
+        <w:tc>
+          <w:tcPr>
+            <w:tcW w:type="dxa" w:w="2160"/>
+          </w:tcPr>
+          <w:p>
+            <w:r>
+              <w:t>Pass</w:t>
+            </w:r>
+          </w:p>
+        </w:tc>
+      </w:tr>
+      <w:tr>
+        <w:tc>
+          <w:tcPr>
+            <w:tcW w:type="dxa" w:w="2160"/>
+          </w:tcPr>
+          <w:p>
+            <w:r>
+              <w:t>1.50 m: Lock-off load ≤ tendon limit</w:t>
+            </w:r>
+          </w:p>
+        </w:tc>
+        <w:tc>
+          <w:tcPr>
+            <w:tcW w:type="dxa" w:w="2160"/>
+          </w:tcPr>
+          <w:p>
+            <w:r>
+              <w:t>329.69</w:t>
+            </w:r>
+          </w:p>
+        </w:tc>
+        <w:tc>
+          <w:tcPr>
+            <w:tcW w:type="dxa" w:w="2160"/>
+          </w:tcPr>
+          <w:p>
+            <w:r>
+              <w:t>547.47</w:t>
+            </w:r>
+          </w:p>
+        </w:tc>
+        <w:tc>
+          <w:tcPr>
+            <w:tcW w:type="dxa" w:w="2160"/>
+          </w:tcPr>
+          <w:p>
+            <w:r>
+              <w:t>Pass</w:t>
+            </w:r>
+          </w:p>
+        </w:tc>
+      </w:tr>
+      <w:tr>
+        <w:tc>
+          <w:tcPr>
+            <w:tcW w:type="dxa" w:w="2160"/>
+          </w:tcPr>
+          <w:p>
+            <w:r>
+              <w:t>1.50 m: Test load ≤ tendon limit</w:t>
+            </w:r>
+          </w:p>
+        </w:tc>
+        <w:tc>
+          <w:tcPr>
+            <w:tcW w:type="dxa" w:w="2160"/>
+          </w:tcPr>
+          <w:p>
+            <w:r>
+              <w:t>438.48</w:t>
+            </w:r>
+          </w:p>
+        </w:tc>
+        <w:tc>
+          <w:tcPr>
+            <w:tcW w:type="dxa" w:w="2160"/>
+          </w:tcPr>
+          <w:p>
+            <w:r>
+              <w:t>625.68</w:t>
+            </w:r>
+          </w:p>
+        </w:tc>
+        <w:tc>
+          <w:tcPr>
+            <w:tcW w:type="dxa" w:w="2160"/>
+          </w:tcPr>
+          <w:p>
+            <w:r>
+              <w:t>Pass</w:t>
+            </w:r>
+          </w:p>
+        </w:tc>
+      </w:tr>
+      <w:tr>
+        <w:tc>
+          <w:tcPr>
+            <w:tcW w:type="dxa" w:w="2160"/>
+          </w:tcPr>
+          <w:p>
+            <w:r>
+              <w:t>1.50 m: Minimum cover over the bond zone centre</w:t>
+            </w:r>
+          </w:p>
+        </w:tc>
+        <w:tc>
+          <w:tcPr>
+            <w:tcW w:type="dxa" w:w="2160"/>
+          </w:tcPr>
+          <w:p>
+            <w:r>
+              <w:t>4.50</w:t>
+            </w:r>
+          </w:p>
+        </w:tc>
+        <w:tc>
+          <w:tcPr>
+            <w:tcW w:type="dxa" w:w="2160"/>
+          </w:tcPr>
+          <w:p>
+            <w:r>
+              <w:t>1.50</w:t>
+            </w:r>
+          </w:p>
+        </w:tc>
+        <w:tc>
+          <w:tcPr>
+            <w:tcW w:type="dxa" w:w="2160"/>
+          </w:tcPr>
+          <w:p>
+            <w:r>
+              <w:t>Fail</w:t>
+            </w:r>
+          </w:p>
+        </w:tc>
+      </w:tr>
+      <w:tr>
+        <w:tc>
+          <w:tcPr>
+            <w:tcW w:type="dxa" w:w="2160"/>
+          </w:tcPr>
+          <w:p>
+            <w:r>
+              <w:t>4.50 m: Design load ≤ tendon limit</w:t>
+            </w:r>
+          </w:p>
+        </w:tc>
+        <w:tc>
+          <w:tcPr>
+            <w:tcW w:type="dxa" w:w="2160"/>
+          </w:tcPr>
+          <w:p>
+            <w:r>
+              <w:t>339.06</w:t>
+            </w:r>
+          </w:p>
+        </w:tc>
+        <w:tc>
+          <w:tcPr>
+            <w:tcW w:type="dxa" w:w="2160"/>
+          </w:tcPr>
+          <w:p>
+            <w:r>
+              <w:t>469.26</w:t>
+            </w:r>
+          </w:p>
+        </w:tc>
+        <w:tc>
+          <w:tcPr>
+            <w:tcW w:type="dxa" w:w="2160"/>
+          </w:tcPr>
+          <w:p>
+            <w:r>
+              <w:t>Pass</w:t>
+            </w:r>
+          </w:p>
+        </w:tc>
+      </w:tr>
+      <w:tr>
+        <w:tc>
+          <w:tcPr>
+            <w:tcW w:type="dxa" w:w="2160"/>
+          </w:tcPr>
+          <w:p>
+            <w:r>
+              <w:t>4.50 m: Lock-off load ≤ tendon limit</w:t>
+            </w:r>
+          </w:p>
+        </w:tc>
+        <w:tc>
+          <w:tcPr>
+            <w:tcW w:type="dxa" w:w="2160"/>
+          </w:tcPr>
+          <w:p>
+            <w:r>
+              <w:t>339.06</w:t>
+            </w:r>
+          </w:p>
+        </w:tc>
+        <w:tc>
+          <w:tcPr>
+            <w:tcW w:type="dxa" w:w="2160"/>
+          </w:tcPr>
+          <w:p>
+            <w:r>
+              <w:t>547.47</w:t>
+            </w:r>
+          </w:p>
+        </w:tc>
+        <w:tc>
+          <w:tcPr>
+            <w:tcW w:type="dxa" w:w="2160"/>
+          </w:tcPr>
+          <w:p>
+            <w:r>
+              <w:t>Pass</w:t>
+            </w:r>
+          </w:p>
+        </w:tc>
+      </w:tr>
+      <w:tr>
+        <w:tc>
+          <w:tcPr>
+            <w:tcW w:type="dxa" w:w="2160"/>
+          </w:tcPr>
+          <w:p>
+            <w:r>
+              <w:t>4.50 m: Test load ≤ tendon limit</w:t>
+            </w:r>
+          </w:p>
+        </w:tc>
+        <w:tc>
+          <w:tcPr>
+            <w:tcW w:type="dxa" w:w="2160"/>
+          </w:tcPr>
+          <w:p>
+            <w:r>
+              <w:t>450.95</w:t>
+            </w:r>
+          </w:p>
+        </w:tc>
+        <w:tc>
+          <w:tcPr>
+            <w:tcW w:type="dxa" w:w="2160"/>
+          </w:tcPr>
+          <w:p>
+            <w:r>
+              <w:t>625.68</w:t>
+            </w:r>
+          </w:p>
+        </w:tc>
+        <w:tc>
+          <w:tcPr>
+            <w:tcW w:type="dxa" w:w="2160"/>
+          </w:tcPr>
+          <w:p>
+            <w:r>
+              <w:t>Pass</w:t>
+            </w:r>
+          </w:p>
+        </w:tc>
+      </w:tr>
+      <w:tr>
+        <w:tc>
+          <w:tcPr>
+            <w:tcW w:type="dxa" w:w="2160"/>
+          </w:tcPr>
+          <w:p>
+            <w:r>
+              <w:t>4.50 m: Minimum cover over the bond zone centre</w:t>
+            </w:r>
+          </w:p>
+        </w:tc>
+        <w:tc>
+          <w:tcPr>
+            <w:tcW w:type="dxa" w:w="2160"/>
+          </w:tcPr>
+          <w:p>
+            <w:r>
+              <w:t>4.50</w:t>
+            </w:r>
+          </w:p>
+        </w:tc>
+        <w:tc>
+          <w:tcPr>
+            <w:tcW w:type="dxa" w:w="2160"/>
+          </w:tcPr>
+          <w:p>
+            <w:r>
+              <w:t>4.50</w:t>
+            </w:r>
+          </w:p>
+        </w:tc>
+        <w:tc>
+          <w:tcPr>
+            <w:tcW w:type="dxa" w:w="2160"/>
+          </w:tcPr>
+          <w:p>
+            <w:r>
+              <w:t>Pass</w:t>
+            </w:r>
+          </w:p>
+        </w:tc>
+      </w:tr>
+      <w:tr>
+        <w:tc>
+          <w:tcPr>
+            <w:tcW w:type="dxa" w:w="2160"/>
+          </w:tcPr>
+          <w:p>
+            <w:r>
+              <w:t>7.50 m: Design load ≤ tendon limit</w:t>
+            </w:r>
+          </w:p>
+        </w:tc>
+        <w:tc>
+          <w:tcPr>
+            <w:tcW w:type="dxa" w:w="2160"/>
+          </w:tcPr>
+          <w:p>
+            <w:r>
+              <w:t>311.46</w:t>
+            </w:r>
+          </w:p>
+        </w:tc>
+        <w:tc>
+          <w:tcPr>
+            <w:tcW w:type="dxa" w:w="2160"/>
+          </w:tcPr>
+          <w:p>
+            <w:r>
+              <w:t>312.84</w:t>
+            </w:r>
+          </w:p>
+        </w:tc>
+        <w:tc>
+          <w:tcPr>
+            <w:tcW w:type="dxa" w:w="2160"/>
+          </w:tcPr>
+          <w:p>
+            <w:r>
+              <w:t>Pass</w:t>
+            </w:r>
+          </w:p>
+        </w:tc>
+      </w:tr>
+      <w:tr>
+        <w:tc>
+          <w:tcPr>
+            <w:tcW w:type="dxa" w:w="2160"/>
+          </w:tcPr>
+          <w:p>
+            <w:r>
+              <w:t>7.50 m: Lock-off load ≤ tendon limit</w:t>
+            </w:r>
+          </w:p>
+        </w:tc>
+        <w:tc>
+          <w:tcPr>
+            <w:tcW w:type="dxa" w:w="2160"/>
+          </w:tcPr>
+          <w:p>
+            <w:r>
+              <w:t>311.46</w:t>
+            </w:r>
+          </w:p>
+        </w:tc>
+        <w:tc>
+          <w:tcPr>
+            <w:tcW w:type="dxa" w:w="2160"/>
+          </w:tcPr>
+          <w:p>
+            <w:r>
+              <w:t>364.98</w:t>
+            </w:r>
+          </w:p>
+        </w:tc>
+        <w:tc>
+          <w:tcPr>
+            <w:tcW w:type="dxa" w:w="2160"/>
+          </w:tcPr>
+          <w:p>
+            <w:r>
+              <w:t>Pass</w:t>
+            </w:r>
+          </w:p>
+        </w:tc>
+      </w:tr>
+      <w:tr>
+        <w:tc>
+          <w:tcPr>
+            <w:tcW w:type="dxa" w:w="2160"/>
+          </w:tcPr>
+          <w:p>
+            <w:r>
+              <w:t>7.50 m: Test load ≤ tendon limit</w:t>
+            </w:r>
+          </w:p>
+        </w:tc>
+        <w:tc>
+          <w:tcPr>
+            <w:tcW w:type="dxa" w:w="2160"/>
+          </w:tcPr>
+          <w:p>
+            <w:r>
+              <w:t>414.24</w:t>
+            </w:r>
+          </w:p>
+        </w:tc>
+        <w:tc>
+          <w:tcPr>
+            <w:tcW w:type="dxa" w:w="2160"/>
+          </w:tcPr>
+          <w:p>
+            <w:r>
+              <w:t>417.12</w:t>
+            </w:r>
+          </w:p>
+        </w:tc>
+        <w:tc>
+          <w:tcPr>
+            <w:tcW w:type="dxa" w:w="2160"/>
+          </w:tcPr>
+          <w:p>
+            <w:r>
+              <w:t>Pass</w:t>
+            </w:r>
+          </w:p>
+        </w:tc>
+      </w:tr>
+      <w:tr>
+        <w:tc>
+          <w:tcPr>
+            <w:tcW w:type="dxa" w:w="2160"/>
+          </w:tcPr>
+          <w:p>
+            <w:r>
+              <w:t>7.50 m: Minimum cover over the bond zone centre</w:t>
+            </w:r>
+          </w:p>
+        </w:tc>
+        <w:tc>
+          <w:tcPr>
+            <w:tcW w:type="dxa" w:w="2160"/>
+          </w:tcPr>
+          <w:p>
+            <w:r>
+              <w:t>4.50</w:t>
+            </w:r>
+          </w:p>
+        </w:tc>
+        <w:tc>
+          <w:tcPr>
+            <w:tcW w:type="dxa" w:w="2160"/>
+          </w:tcPr>
+          <w:p>
+            <w:r>
+              <w:t>7.50</w:t>
+            </w:r>
+          </w:p>
+        </w:tc>
+        <w:tc>
+          <w:tcPr>
+            <w:tcW w:type="dxa" w:w="2160"/>
+          </w:tcPr>
+          <w:p>
+            <w:r>
+              <w:t>Pass</w:t>
             </w:r>
           </w:p>
         </w:tc>
@@ -5939,23 +6851,7 @@
         <w:pStyle w:val="ListBullet"/>
       </w:pPr>
       <w:r>
-        <w:t>Embedment is from moment equilibrium only; the toe force residual 349.8 kN/m is not balanced and is excluded from the shear maximum.</w:t>
-      </w:r>
-    </w:p>
-    <w:p>
-      <w:pPr>
-        <w:pStyle w:val="ListBullet"/>
-      </w:pPr>
-      <w:r>
-        <w:t>Several anchor levels: empirical apparent pressure envelope (sand) for level ground (Terzaghi-Peck, Peck 1969, FHWA GEC-4 ch. 5).</w:t>
-      </w:r>
-    </w:p>
-    <w:p>
-      <w:pPr>
-        <w:pStyle w:val="ListBullet"/>
-      </w:pPr>
-      <w:r>
-        <w:t>The envelope shapes and the hinge method were checked against a course summary of Peck's diagrams, not the original figures; verify before design use.</w:t>
+        <w:t>Apparent pressure envelope (sand), level ground: FHWA GEC-4 5.2.4–5.2.6 (sand and stiff clay trapezoid, figures 24 and 27; soft clay figure 23c). The method is empirical.</w:t>
       </w:r>
     </w:p>
     <w:p>
@@ -5971,7 +6867,7 @@
         <w:pStyle w:val="ListBullet"/>
       </w:pPr>
       <w:r>
-        <w:t>Embedment from moments about the toe under the base reaction R_B and the net pressure below the base (factored passive).</w:t>
+        <w:t>Embedment: moment equilibrium about the toe under the base reaction R_B and the net pressure below the base (passive divided by the given factor of safety). This is deeper than the GEC-4 5.5.3 force criterion.</w:t>
       </w:r>
     </w:p>
     <w:p>
@@ -6003,7 +6899,7 @@
         <w:pStyle w:val="ListBullet"/>
       </w:pPr>
       <w:r>
-        <w:t>The bond zone starts 2.0 m behind the failure surface: max(1.5 m, 0.2 H) (GEC-4 5.3.4 says H/5 or 1.5 m; the larger is taken).</w:t>
+        <w:t>1.50 m: The bond zone starts 2.0 m beyond the failure surface, measured normal to the surface (GEC-4 figure 37a: χ = 1.5 m or 0.2H, whichever is greater).</w:t>
       </w:r>
     </w:p>
     <w:p>
@@ -6011,7 +6907,7 @@
         <w:pStyle w:val="ListBullet"/>
       </w:pPr>
       <w:r>
-        <w:t>Minimum unbonded length 4.5 m assumed (strand) (GEC-4 5.3.4).</w:t>
+        <w:t>1.50 m: Minimum unbonded length 4.5 m assumed (strand) (GEC-4 5.3.4).</w:t>
       </w:r>
     </w:p>
     <w:p>
@@ -6019,7 +6915,7 @@
         <w:pStyle w:val="ListBullet"/>
       </w:pPr>
       <w:r>
-        <w:t>The failure surface starts at the excavation base corner (GEC-4 5.3.2).</w:t>
+        <w:t>1.50 m: The failure surface starts at the excavation base corner (GEC-4 5.3.2).</w:t>
       </w:r>
     </w:p>
     <w:p>
@@ -6027,7 +6923,7 @@
         <w:pStyle w:val="ListBullet"/>
       </w:pPr>
       <w:r>
-        <w:t>Level retained ground and a vertical wall face are assumed; sloping ground is not supported yet.</w:t>
+        <w:t>1.50 m: Level retained ground and a vertical wall face are assumed; sloping ground is not supported yet.</w:t>
       </w:r>
     </w:p>
     <w:p>
@@ -6035,7 +6931,7 @@
         <w:pStyle w:val="ListBullet"/>
       </w:pPr>
       <w:r>
-        <w:t>Maximum test load = 1.33 × design load (GEC-4 pp. 75-77).</w:t>
+        <w:t>1.50 m: Maximum test load = 1.33 × design load (GEC-4 pp. 75-77).</w:t>
       </w:r>
     </w:p>
     <w:p>
@@ -6043,7 +6939,127 @@
         <w:pStyle w:val="ListBullet"/>
       </w:pPr>
       <w:r>
-        <w:t>Tendon limits 0.6 / 0.7 / 0.8 SMTS (design / lock-off / test), GEC-4 p. 77.</w:t>
+        <w:t>1.50 m: Tendon limits 0.6 / 0.7 / 0.8 SMTS (design / lock-off / test), GEC-4 p. 77.</w:t>
+      </w:r>
+    </w:p>
+    <w:p>
+      <w:pPr>
+        <w:pStyle w:val="ListBullet"/>
+      </w:pPr>
+      <w:r>
+        <w:t>1.50 m: Minimum bond length 4.5 m (soil, strand) applied (GEC-4 appendix E, 3B).</w:t>
+      </w:r>
+    </w:p>
+    <w:p>
+      <w:pPr>
+        <w:pStyle w:val="ListBullet"/>
+      </w:pPr>
+      <w:r>
+        <w:t>4.50 m: The bond zone starts 2.0 m beyond the failure surface, measured normal to the surface (GEC-4 figure 37a: χ = 1.5 m or 0.2H, whichever is greater).</w:t>
+      </w:r>
+    </w:p>
+    <w:p>
+      <w:pPr>
+        <w:pStyle w:val="ListBullet"/>
+      </w:pPr>
+      <w:r>
+        <w:t>4.50 m: Minimum unbonded length 4.5 m assumed (strand) (GEC-4 5.3.4).</w:t>
+      </w:r>
+    </w:p>
+    <w:p>
+      <w:pPr>
+        <w:pStyle w:val="ListBullet"/>
+      </w:pPr>
+      <w:r>
+        <w:t>4.50 m: The failure surface starts at the excavation base corner (GEC-4 5.3.2).</w:t>
+      </w:r>
+    </w:p>
+    <w:p>
+      <w:pPr>
+        <w:pStyle w:val="ListBullet"/>
+      </w:pPr>
+      <w:r>
+        <w:t>4.50 m: Level retained ground and a vertical wall face are assumed; sloping ground is not supported yet.</w:t>
+      </w:r>
+    </w:p>
+    <w:p>
+      <w:pPr>
+        <w:pStyle w:val="ListBullet"/>
+      </w:pPr>
+      <w:r>
+        <w:t>4.50 m: Maximum test load = 1.33 × design load (GEC-4 pp. 75-77).</w:t>
+      </w:r>
+    </w:p>
+    <w:p>
+      <w:pPr>
+        <w:pStyle w:val="ListBullet"/>
+      </w:pPr>
+      <w:r>
+        <w:t>4.50 m: Tendon limits 0.6 / 0.7 / 0.8 SMTS (design / lock-off / test), GEC-4 p. 77.</w:t>
+      </w:r>
+    </w:p>
+    <w:p>
+      <w:pPr>
+        <w:pStyle w:val="ListBullet"/>
+      </w:pPr>
+      <w:r>
+        <w:t>4.50 m: Minimum bond length 4.5 m (soil, strand) applied (GEC-4 appendix E, 3B).</w:t>
+      </w:r>
+    </w:p>
+    <w:p>
+      <w:pPr>
+        <w:pStyle w:val="ListBullet"/>
+      </w:pPr>
+      <w:r>
+        <w:t>7.50 m: The bond zone starts 2.0 m beyond the failure surface, measured normal to the surface (GEC-4 figure 37a: χ = 1.5 m or 0.2H, whichever is greater).</w:t>
+      </w:r>
+    </w:p>
+    <w:p>
+      <w:pPr>
+        <w:pStyle w:val="ListBullet"/>
+      </w:pPr>
+      <w:r>
+        <w:t>7.50 m: Minimum unbonded length 4.5 m assumed (strand) (GEC-4 5.3.4).</w:t>
+      </w:r>
+    </w:p>
+    <w:p>
+      <w:pPr>
+        <w:pStyle w:val="ListBullet"/>
+      </w:pPr>
+      <w:r>
+        <w:t>7.50 m: The failure surface starts at the excavation base corner (GEC-4 5.3.2).</w:t>
+      </w:r>
+    </w:p>
+    <w:p>
+      <w:pPr>
+        <w:pStyle w:val="ListBullet"/>
+      </w:pPr>
+      <w:r>
+        <w:t>7.50 m: Level retained ground and a vertical wall face are assumed; sloping ground is not supported yet.</w:t>
+      </w:r>
+    </w:p>
+    <w:p>
+      <w:pPr>
+        <w:pStyle w:val="ListBullet"/>
+      </w:pPr>
+      <w:r>
+        <w:t>7.50 m: Maximum test load = 1.33 × design load (GEC-4 pp. 75-77).</w:t>
+      </w:r>
+    </w:p>
+    <w:p>
+      <w:pPr>
+        <w:pStyle w:val="ListBullet"/>
+      </w:pPr>
+      <w:r>
+        <w:t>7.50 m: Tendon limits 0.6 / 0.7 / 0.8 SMTS (design / lock-off / test), GEC-4 p. 77.</w:t>
+      </w:r>
+    </w:p>
+    <w:p>
+      <w:pPr>
+        <w:pStyle w:val="ListBullet"/>
+      </w:pPr>
+      <w:r>
+        <w:t>7.50 m: Minimum bond length 4.5 m (soil, strand) applied (GEC-4 appendix E, 3B).</w:t>
       </w:r>
     </w:p>
     <w:p>
@@ -6059,7 +7075,7 @@
         <w:pStyle w:val="ListBullet"/>
       </w:pPr>
       <w:r>
-        <w:t>No source was given for the load transfer / bond value; presumptive values must be verified by anchor tests.</w:t>
+        <w:t>External (global) stability and deep-seated (Kranz) failure are not checked. Analyse slip surfaces passing behind and through the anchors separately by limit equilibrium; GEC-4 5.8.3 requires FS ≥ 1.3 (1.5 for critical permanent works).</w:t>
       </w:r>
     </w:p>
     <w:p>
@@ -6067,7 +7083,7 @@
         <w:pStyle w:val="ListBullet"/>
       </w:pPr>
       <w:r>
-        <w:t>Inclination 0.0° is outside the usual GEC-4 range of 10.0°–45.0°.</w:t>
+        <w:t>Embedment comes from moment equilibrium about the toe (deeper than the GEC-4 5.5.3 force criterion, on the safe side). A toe force residual of 290.4 kN/m is not balanced and is not included in the shear maximum; assess it separately for the embedded section.</w:t>
       </w:r>
     </w:p>
     <w:p>
@@ -6075,7 +7091,7 @@
         <w:pStyle w:val="ListBullet"/>
       </w:pPr>
       <w:r>
-        <w:t>Cover over the bond zone centre is 1.5 m; at least 4.5 m is required (GEC-4 5.3.7).</w:t>
+        <w:t>The anchor free length uses the 45° + φ′/2 planar wedge. Per GEC-4 5.3.2 this applies to uniform cohesionless soil with a level surface; with layering, clay or surcharge find the critical surface separately by trial wedge / limit equilibrium.</w:t>
       </w:r>
     </w:p>
     <w:p>
@@ -6083,7 +7099,63 @@
         <w:pStyle w:val="ListBullet"/>
       </w:pPr>
       <w:r>
-        <w:t>2 strands is not listed in GEC-4 Table 10; capacity is taken as a multiple of one strand.</w:t>
+        <w:t>1.50 m: No source was given for the load transfer / bond value; presumptive values must be verified by anchor tests.</w:t>
+      </w:r>
+    </w:p>
+    <w:p>
+      <w:pPr>
+        <w:pStyle w:val="ListBullet"/>
+      </w:pPr>
+      <w:r>
+        <w:t>1.50 m: Inclination 0.0° is outside the usual GEC-4 range of 10.0°–45.0°.</w:t>
+      </w:r>
+    </w:p>
+    <w:p>
+      <w:pPr>
+        <w:pStyle w:val="ListBullet"/>
+      </w:pPr>
+      <w:r>
+        <w:t>1.50 m: Cover over the bond zone centre is 1.5 m; at least 4.5 m is required (GEC-4 5.3.7).</w:t>
+      </w:r>
+    </w:p>
+    <w:p>
+      <w:pPr>
+        <w:pStyle w:val="ListBullet"/>
+      </w:pPr>
+      <w:r>
+        <w:t>4.50 m: No source was given for the load transfer / bond value; presumptive values must be verified by anchor tests.</w:t>
+      </w:r>
+    </w:p>
+    <w:p>
+      <w:pPr>
+        <w:pStyle w:val="ListBullet"/>
+      </w:pPr>
+      <w:r>
+        <w:t>4.50 m: Inclination 0.0° is outside the usual GEC-4 range of 10.0°–45.0°.</w:t>
+      </w:r>
+    </w:p>
+    <w:p>
+      <w:pPr>
+        <w:pStyle w:val="ListBullet"/>
+      </w:pPr>
+      <w:r>
+        <w:t>7.50 m: No source was given for the load transfer / bond value; presumptive values must be verified by anchor tests.</w:t>
+      </w:r>
+    </w:p>
+    <w:p>
+      <w:pPr>
+        <w:pStyle w:val="ListBullet"/>
+      </w:pPr>
+      <w:r>
+        <w:t>7.50 m: 2 strands is not listed in GEC-4 Table 10; capacity is taken as a multiple of one strand.</w:t>
+      </w:r>
+    </w:p>
+    <w:p>
+      <w:pPr>
+        <w:pStyle w:val="ListBullet"/>
+      </w:pPr>
+      <w:r>
+        <w:t>7.50 m: Inclination 0.0° is outside the usual GEC-4 range of 10.0°–45.0°.</w:t>
       </w:r>
     </w:p>
     <w:p>
@@ -6099,7 +7171,7 @@
         <w:pStyle w:val="ListBullet"/>
       </w:pPr>
       <w:r>
-        <w:t>Terzaghi and Peck (1967) Soil Mechanics in Engineering Practice; Peck (1969) 7th ICSMFE</w:t>
+        <w:t>FHWA GEC-4 (FHWA-IF-99-015) 5.2.4-5.2.6, figures 23, 24, 27-29, eq. 9-12 (apparent earth pressure envelopes)</w:t>
       </w:r>
     </w:p>
     <w:p>
@@ -6107,7 +7179,7 @@
         <w:pStyle w:val="ListBullet"/>
       </w:pPr>
       <w:r>
-        <w:t>FHWA GEC-4 (FHWA-IF-99-015) ch. 5, apparent pressure envelopes and hinge/tributary methods</w:t>
+        <w:t>FHWA GEC-4 (FHWA-IF-99-015) 5.3.3, figures 33-34 (hinge and tributary methods), 5.4.1 (wall moments)</w:t>
       </w:r>
     </w:p>
     <w:p>
@@ -6115,7 +7187,15 @@
         <w:pStyle w:val="ListBullet"/>
       </w:pPr>
       <w:r>
-        <w:t>USS Steel Sheet Piling Design Manual; USACE EM 1110-2-2504 (free earth support)</w:t>
+        <w:t>FHWA GEC-4 (FHWA-IF-99-015) 5.5.3 (embedment; passive factor of safety)</w:t>
+      </w:r>
+    </w:p>
+    <w:p>
+      <w:pPr>
+        <w:pStyle w:val="ListBullet"/>
+      </w:pPr>
+      <w:r>
+        <w:t>FHWA GEC-4 (FHWA-IF-99-015) 5.8.3 (external stability: not analysed, check separately)</w:t>
       </w:r>
     </w:p>
     <w:sectPr>

</xml_diff>